<commit_message>
feat: complete Phase 20 (O*NET 31.0 ingestion, India trade crosswalk, aptitude grounding & work flags)
</commit_message>
<xml_diff>
--- a/KaushalPath — Data-Grounded Assessment & Recommendation Prompt Pack (Phases 19–24).docx
+++ b/KaushalPath — Data-Grounded Assessment & Recommendation Prompt Pack (Phases 19–24).docx
@@ -828,7 +828,7 @@
           <w:p>
             <w:pPr/>
             <w:r>
-              <w:t xml:space="preserve">O*NET 31.0 Interests and Interests Illustrative Activities</w:t>
+              <w:t xml:space="preserve">O*NET 31.0 Career Interest Types (formerly Interests) and Interests Illustrative Activities</w:t>
             </w:r>
           </w:p>
         </w:tc>
@@ -1946,6 +1946,1059 @@
       <w:pPr/>
       <w:r>
         <w:t xml:space="preserve">Files touched: backend/app/data/raw/SOURCES.yaml, scripts/validate_sources.py, scripts/resolve_trades.py, scripts/data_report.py, backend/app/services/geo_svc.py, backend/app/services/evidence_svc.py, new Alembic revision, backend/app/models/ (trade, crosswalk, geo).</w:t>
+      </w:r>
+    </w:p>
+    <w:p>
+      <w:pPr>
+        <w:pStyle w:val="Heading2"/>
+      </w:pPr>
+      <w:r>
+        <w:t xml:space="preserve">Phase 20: Occupation master from O*NET 31.0 (interests, abilities, work context)</w:t>
+      </w:r>
+    </w:p>
+    <w:p>
+      <w:pPr/>
+      <w:r>
+        <w:t xml:space="preserve">Phase 20 replaces hand-entered RIASEC vectors with O*NET profiles and adds the ability requirements that make aptitude matter for ranking. O*NET describes US occupations, so treat its profiles as a prior to be validated on Indian incumbents in Phases 21 and 24. Priority P0, effort 3 to 4 days.</w:t>
+      </w:r>
+    </w:p>
+    <w:p>
+      <w:pPr>
+        <w:pStyle w:val="Code"/>
+      </w:pPr>
+      <w:bookmarkStart w:id="3" w:name="bongo_lang_text_3"/>
+      <w:bookmarkEnd w:id="3"/>
+      <w:r>
+        <w:t xml:space="preserve">PHASE 20 - OCCUPATION MASTER FROM O*NET 31.0. Backend + scripts only. No UI.</w:t>
+        <w:br/>
+        <w:t xml:space="preserve">Prereq: Phase 19 merged (trades, crosswalk, evidence_grade). Read the Data Addendum first.</w:t>
+        <w:br/>
+        <w:br/>
+        <w:t xml:space="preserve">Context: occupations.csv RIASEC vectors (0-10) are hand-entered. Occupations carry no ability</w:t>
+        <w:br/>
+        <w:t xml:space="preserve">requirements, so aptitude cannot influence ranking (features.py aptitude_fit is constant per</w:t>
+        <w:br/>
+        <w:t xml:space="preserve">learner). scripts/load_onet.py expects wide columns (title, riasec_r..riasec_c) and a file</w:t>
+        <w:br/>
+        <w:t xml:space="preserve">called Interests. In O*NET 31.0 that file is named Career Interest Types (renamed in 30.3). It</w:t>
+        <w:br/>
+        <w:t xml:space="preserve">is long format: O*NET-SOC Code, Title, Element ID, Element Name, Scale ID, Scale Name, Data</w:t>
+        <w:br/>
+        <w:t xml:space="preserve">Value, Date, Domain Source. Scale OI = RIASEC level per element; scale IH = high-point code</w:t>
+        <w:br/>
+        <w:t xml:space="preserve">(1 R, 2 I, 3 A, 4 S, 5 E, 6 C; 0 = none). It has NO sample-size or standard-error columns and</w:t>
+        <w:br/>
+        <w:t xml:space="preserve">rates only about 900 occupations. Read the 31.0 data dictionary and adapt; do not trust the</w:t>
+        <w:br/>
+        <w:t xml:space="preserve">loader's expected columns.</w:t>
+        <w:br/>
+        <w:br/>
+        <w:t xml:space="preserve">Do:</w:t>
+        <w:br/>
+        <w:t xml:space="preserve">A. SOURCES. Manually download O*NET 31.0 (CSV) into backend/app/data/raw/onet/: Occupation</w:t>
+        <w:br/>
+        <w:t xml:space="preserve">   Data, Career Interest Types, Interests Illustrative Activities, Abilities, Knowledge, Work</w:t>
+        <w:br/>
+        <w:t xml:space="preserve">   Context, Work Activities, Job Zones, Scales Reference, Content Model Reference, plus the</w:t>
+        <w:br/>
+        <w:t xml:space="preserve">   related crosswalks. Register them in SOURCES.yaml. Licence is CC BY 4.0: create</w:t>
+        <w:br/>
+        <w:t xml:space="preserve">   docs/ATTRIBUTION.md.</w:t>
+        <w:br/>
+        <w:t xml:space="preserve">B. INTERESTS. Rewrite scripts/load_onet.py: pivot scale OI to one row per occupation. Read the</w:t>
+        <w:br/>
+        <w:t xml:space="preserve">   OI value range from the Scales Reference and rescale to [0,1]; document the formula. Keep</w:t>
+        <w:br/>
+        <w:t xml:space="preserve">   the IH high-point codes. n and standard error stay NULL because the file has none (do not</w:t>
+        <w:br/>
+        <w:t xml:space="preserve">   invent them). Store grade A, is_demo=false.</w:t>
+        <w:br/>
+        <w:t xml:space="preserve">C. ABILITIES. New table occupation_abilities(occupation_id, num, verbal, spatial, mech,</w:t>
+        <w:br/>
+        <w:t xml:space="preserve">   source, n). For each construct: requirement = sqrt(norm_importance x norm_level) averaged</w:t>
+        <w:br/>
+        <w:t xml:space="preserve">   over mapped elements (normalise using the Scales Reference ranges). Mapping lives in</w:t>
+        <w:br/>
+        <w:t xml:space="preserve">   backend/app/data/raw/aptitude_map.yaml. Defaults: num = Mathematical Reasoning + Number</w:t>
+        <w:br/>
+        <w:t xml:space="preserve">   Facility; verbal = Oral + Written Comprehension; spatial = Spatial Orientation +</w:t>
+        <w:br/>
+        <w:t xml:space="preserve">   Visualization; mech = Knowledge: Mechanical. Confirm element names against the Content</w:t>
+        <w:br/>
+        <w:t xml:space="preserve">   Model Reference; an unknown name must fail loudly, not silently drop.</w:t>
+        <w:br/>
+        <w:t xml:space="preserve">D. WORK FLAGS. scripts/derive_work_flags.py reads Work Context and writes</w:t>
+        <w:br/>
+        <w:t xml:space="preserve">   occupations.work_flags JSON {outdoor, hazard, physical_effort, customer_contact} using</w:t>
+        <w:br/>
+        <w:t xml:space="preserve">   thresholds in work_flags.yaml. Flags answer family safety questions and drive an optional</w:t>
+        <w:br/>
+        <w:t xml:space="preserve">   SOFT learner preference. They are never a hard filter and never gated by gender.</w:t>
+        <w:br/>
+        <w:t xml:space="preserve">E. INDIA MAPPING. scripts/map_onet_to_india.py builds crosswalk rows</w:t>
+        <w:br/>
+        <w:t xml:space="preserve">   O*NET-SOC &gt; SOC 2018 &gt; ISCO-08 &gt; NCO-2015 (4-digit) &gt; trade_id. Use official published</w:t>
+        <w:br/>
+        <w:t xml:space="preserve">   crosswalks wherever they exist (method='official'); name matching is only</w:t>
+        <w:br/>
+        <w:t xml:space="preserve">   method='name_match' with needs_review=true. One trade may map to several O*NET codes:</w:t>
+        <w:br/>
+        <w:t xml:space="preserve">   aggregate with weights = relation confidence, store the contributing codes and the spread,</w:t>
+        <w:br/>
+        <w:t xml:space="preserve">   and flag any trade whose spread (SD of any RIASEC dimension) exceeds 0.2 as needs_review.</w:t>
+        <w:br/>
+        <w:t xml:space="preserve">F. JOB ZONE CHECK. For each trade compare Job Zone to NSQF level and min_edu; write mismatches</w:t>
+        <w:br/>
+        <w:t xml:space="preserve">   to data/processed/jobzone_nsqf_review.csv. Report only; never auto-correct.</w:t>
+        <w:br/>
+        <w:t xml:space="preserve">G. PRECEDENCE in build_occupation_master.py: PS-provided &gt; O*NET-derived (grade A) &gt; curated</w:t>
+        <w:br/>
+        <w:t xml:space="preserve">   demo (grade D). Unmapped trades keep the demo vector and stay is_demo=true. Never blend</w:t>
+        <w:br/>
+        <w:t xml:space="preserve">   demo and real values inside one vector.</w:t>
+        <w:br/>
+        <w:t xml:space="preserve">H. HINDI NAMES. Do not rely on ESCO for Hindi. Keep name_hi from NCVT/NSDC titles, otherwise</w:t>
+        <w:br/>
+        <w:t xml:space="preserve">   a reviewed translation with needs_review=true.</w:t>
+        <w:br/>
+        <w:t xml:space="preserve">I. TESTS. Pivot fixture (5 occupations, OI + IH); rescale bounds; aptitude_map unknown-element</w:t>
+        <w:br/>
+        <w:t xml:space="preserve">   failure; precedence; spread flag; data_report shows % of vocational trades with a real</w:t>
+        <w:br/>
+        <w:t xml:space="preserve">   RIASEC vector and a real ability vector.</w:t>
+        <w:br/>
+        <w:br/>
+        <w:t xml:space="preserve">Gate:</w:t>
+        <w:br/>
+        <w:t xml:space="preserve">- `make check` green.</w:t>
+        <w:br/>
+        <w:t xml:space="preserve">- Target (report the real number, do not pad): &gt;= 70% of vocational trades have grade-A RIASEC</w:t>
+        <w:br/>
+        <w:t xml:space="preserve">  and ability vectors. O*NET rates only part of its occupation list and Indian trades such as</w:t>
+        <w:br/>
+        <w:t xml:space="preserve">  some crafts will not map, so expect gaps; the rest stay explicit demo with the badge.</w:t>
+        <w:br/>
+        <w:t xml:space="preserve">- jobzone_nsqf_review.csv and the spread-flag list are written for human review.</w:t>
+        <w:br/>
+        <w:t xml:space="preserve">- docs/ATTRIBUTION.md exists.</w:t>
+        <w:br/>
+        <w:t xml:space="preserve">STOP and report with pasted command output.</w:t>
+      </w:r>
+    </w:p>
+    <w:p>
+      <w:pPr/>
+      <w:r>
+        <w:t xml:space="preserve">Files touched: scripts/load_onet.py (rewrite), scripts/derive_work_flags.py, scripts/map_onet_to_india.py, scripts/build_occupation_master.py, backend/app/data/raw/aptitude_map.yaml, work_flags.yaml, backend/app/models/occupation.py (+ occupation_abilities), new Alembic revision, docs/ATTRIBUTION.md.</w:t>
+      </w:r>
+    </w:p>
+    <w:p>
+      <w:pPr>
+        <w:pStyle w:val="Heading2"/>
+      </w:pPr>
+      <w:r>
+        <w:t xml:space="preserve">Phase 21: Assessment v2 (grounded items, calibration, aptitude requirements)</w:t>
+      </w:r>
+    </w:p>
+    <w:p>
+      <w:pPr/>
+      <w:r>
+        <w:t xml:space="preserve">Phase 21 makes the assessment measurable: items grounded in O*NET activities, difficulty calibrated on real respondents, and an aptitude score that can actually change the ranking. Your EVAL_REPORT shows exact top-3 order agreement of about 74%, so the phase also adds a forced-choice tie-break. Priority P0, effort 4 to 5 days, plus a pilot of about 300 learners for calibration.</w:t>
+      </w:r>
+    </w:p>
+    <w:p>
+      <w:pPr>
+        <w:pStyle w:val="Code"/>
+      </w:pPr>
+      <w:bookmarkStart w:id="4" w:name="bongo_lang_text_4"/>
+      <w:bookmarkEnd w:id="4"/>
+      <w:r>
+        <w:t xml:space="preserve">PHASE 21 - ASSESSMENT V2. Backend + item banks + eval harness. Frontend only where stated.</w:t>
+        <w:br/>
+        <w:t xml:space="preserve">Prereq: Phase 20 merged (occupation_abilities, grade-A RIASEC). Read the Data Addendum.</w:t>
+        <w:br/>
+        <w:br/>
+        <w:t xml:space="preserve">Context: ml/assessment has 72 RIASEC items (12 per dimension, activity wording, EN+HI) and 20</w:t>
+        <w:br/>
+        <w:t xml:space="preserve">aptitude items (5 per construct, e.g. "3 + 5 x 2 = ?"). adaptive.py uses each item's hand-set</w:t>
+        <w:br/>
+        <w:t xml:space="preserve">`difficulty` as the IRT b-parameter with a fixed discrimination IRT_A = 1.0. G4 (97.5%) is</w:t>
+        <w:br/>
+        <w:t xml:space="preserve">measured on simulated respondents only; exact top-3 order agreement is about 74%.</w:t>
+        <w:br/>
+        <w:br/>
+        <w:t xml:space="preserve">Do:</w:t>
+        <w:br/>
+        <w:t xml:space="preserve">A. ITEM GROUNDING. Build ml/assessment/items_v2/interest_items.json. Each item has: id, dimension,</w:t>
+        <w:br/>
+        <w:t xml:space="preserve">   text_en, text_hi (plain Hindi, Class 5-6 reading level, &lt;= 12 words), source_element (the</w:t>
+        <w:br/>
+        <w:t xml:space="preserve">   O*NET Interests Illustrative Activity or Work Activity it derives from), local_context</w:t>
+        <w:br/>
+        <w:t xml:space="preserve">   (the Indian trade family it is relevant to), reviewed_by, needs_review. Describe tasks, not</w:t>
+        <w:br/>
+        <w:t xml:space="preserve">   people; no gendered wording. Keep &gt;= 12 items per RIASEC dimension. Add scripts/check_items.py</w:t>
+        <w:br/>
+        <w:t xml:space="preserve">   that fails on missing fields, &gt; 12 words, or duplicate meaning (embedding cosine &gt; 0.92).</w:t>
+        <w:br/>
+        <w:t xml:space="preserve">B. APTITUDE LADDER. Build items_v2/aptitude_items.json with &gt;= 10 items per construct (num,</w:t>
+        <w:br/>
+        <w:t xml:space="preserve">   verbal, spatial, mech) across 4 difficulty bands anchored to ASER 2023 levels:</w:t>
+        <w:br/>
+        <w:t xml:space="preserve">   band 1 = below ASER division level (subtraction, place value); band 2 = division and</w:t>
+        <w:br/>
+        <w:t xml:space="preserve">   simple fractions; band 3 = Class 8-10 word problems (percent, ratio, units); band 4 =</w:t>
+        <w:br/>
+        <w:t xml:space="preserve">   trade-flavoured (area, gear/lever, series wiring). Spatial and mech items are pictorial.</w:t>
+        <w:br/>
+        <w:t xml:space="preserve">   Verbal items are short Hindi/English notices and instructions. Each item stores band,</w:t>
+        <w:br/>
+        <w:t xml:space="preserve">   aser_anchor and an image path where relevant.</w:t>
+        <w:br/>
+        <w:t xml:space="preserve">C. CALIBRATION PIPELINE. Add table assessment_responses(session_hash, item_id, response,</w:t>
+        <w:br/>
+        <w:t xml:space="preserve">   latency_ms, position, lang, device_class, completed_at). Collect ONLY through the existing</w:t>
+        <w:br/>
+        <w:t xml:space="preserve">   consent flow (docs/PRIVACY.md) and add guardian consent for under-18 participants.</w:t>
+        <w:br/>
+        <w:t xml:space="preserve">   scripts/calibrate_items.py fits a 2PL per item (marginal ML; numpy/scikit-learn only. If a</w:t>
+        <w:br/>
+        <w:t xml:space="preserve">   new dependency is needed, list it in docs/ASSUMPTIONS.md and stop for approval). Output</w:t>
+        <w:br/>
+        <w:t xml:space="preserve">   items_v2/*.calibrated.json with a, b, n, calibrated=true. Items with n &lt; 300 keep their prior</w:t>
+        <w:br/>
+        <w:t xml:space="preserve">   and calibrated=false. adaptive.py must read per-item `a` and `b` instead of IRT_A and the</w:t>
+        <w:br/>
+        <w:t xml:space="preserve">   hand-set difficulty.</w:t>
+        <w:br/>
+        <w:t xml:space="preserve">D. TIE-BREAK. When the top-3 RIASEC scores are within one SEM of each other after the interest</w:t>
+        <w:br/>
+        <w:t xml:space="preserve">   phase, ask up to 3 forced-choice pairs (two activities from the contested dimensions) and</w:t>
+        <w:br/>
+        <w:t xml:space="preserve">   update theta. Cap total interest items at the existing HARD_CAP.</w:t>
+        <w:br/>
+        <w:t xml:space="preserve">E. LOW-LITERACY SUPPORT (small, optional). API item_type = likert3 | pair. likert3 uses</w:t>
+        <w:br/>
+        <w:t xml:space="preserve">   like / unsure / dislike with icons. Wire QuestionCard.tsx to render it with the existing</w:t>
+        <w:br/>
+        <w:t xml:space="preserve">   ReadThisScreen audio. Do not change other screens.</w:t>
+        <w:br/>
+        <w:t xml:space="preserve">F. APTITUDE FIT FUNCTION (pure module, wired in Phase 23). ml/ranking/aptitude_fit.py:</w:t>
+        <w:br/>
+        <w:t xml:space="preserve">   aptitude_match(learner_theta, learner_se, occ_requirements) -&gt; {score, shortfalls, confidence}.</w:t>
+        <w:br/>
+        <w:t xml:space="preserve">   Link scales by percentile: learner percentile against pilot norms, occupation requirement</w:t>
+        <w:br/>
+        <w:t xml:space="preserve">   percentile against all vocational occupations. Count SHORTFALL only (learner below</w:t>
+        <w:br/>
+        <w:t xml:space="preserve">   requirement); surplus is never a penalty. When SE is high, shrink toward neutral and lower</w:t>
+        <w:br/>
+        <w:t xml:space="preserve">   confidence. Document the percentile linking in docs/ASSUMPTIONS.md as a default.</w:t>
+        <w:br/>
+        <w:t xml:space="preserve">G. VALIDITY STUDY SCRIPTS (run during pilot, not in CI):</w:t>
+        <w:br/>
+        <w:t xml:space="preserve">   - reliability: test-retest after &gt;= 14 days, n &gt;= 60, report r per dimension.</w:t>
+        <w:br/>
+        <w:t xml:space="preserve">   - convergent: same learners also answer the O*NET Interest Profiler short form (check its</w:t>
+        <w:br/>
+        <w:t xml:space="preserve">     current terms) or receive counsellor-assigned Holland codes; report correlation per</w:t>
+        <w:br/>
+        <w:t xml:space="preserve">     dimension, n &gt;= 200.</w:t>
+        <w:br/>
+        <w:t xml:space="preserve">   - known-groups: 15+ trainees per trade family from partner ITIs; report AUC for predicting</w:t>
+        <w:br/>
+        <w:t xml:space="preserve">     trade family from RIASEC profile.</w:t>
+        <w:br/>
+        <w:t xml:space="preserve">   - India adjustment: scripts/adjust_occupation_riasec.py updates each occupation vector =</w:t>
+        <w:br/>
+        <w:t xml:space="preserve">     w x incumbent mean + (1 - w) x O*NET prior, w = n / (n + 20). Store prior, incumbent n and</w:t>
+        <w:br/>
+        <w:t xml:space="preserve">     result separately.</w:t>
+        <w:br/>
+        <w:t xml:space="preserve">H. TESTS. Item bank structure; parameter-recovery test (simulate 2,000 respondents from known</w:t>
+        <w:br/>
+        <w:t xml:space="preserve">   a and b, calibration recovers within +/- 0.25); adaptive uses per-item a; tie-break unit</w:t>
+        <w:br/>
+        <w:t xml:space="preserve">   tests; aptitude_match table-test (shortfall only, SE shrinkage); check_items failures.</w:t>
+        <w:br/>
+        <w:br/>
+        <w:t xml:space="preserve">Gate:</w:t>
+        <w:br/>
+        <w:t xml:space="preserve">- `make check` green; `make eval` reports G4 as set agreement AND exact order, both labelled</w:t>
+        <w:br/>
+        <w:t xml:space="preserve">  "simulated" until pilot data exists. Exact order must not fall below the 74% baseline.</w:t>
+        <w:br/>
+        <w:t xml:space="preserve">- scripts/check_items.py passes; parameter-recovery test passes.</w:t>
+        <w:br/>
+        <w:t xml:space="preserve">- Validity scripts run end to end on a fixture; real numbers are reported only after pilot.</w:t>
+        <w:br/>
+        <w:t xml:space="preserve">STOP and report with pasted command output.</w:t>
+      </w:r>
+    </w:p>
+    <w:p>
+      <w:pPr/>
+      <w:r>
+        <w:t xml:space="preserve">Files touched: backend/app/ml/assessment/ (adaptive.py, scoring.py, items_v2/), backend/app/ml/ranking/aptitude_fit.py, backend/app/models/assessment.py (+ responses table), scripts/check_items.py, scripts/calibrate_items.py, scripts/adjust_occupation_riasec.py, frontend QuestionCard.tsx (item E only), new Alembic revision.</w:t>
+      </w:r>
+    </w:p>
+    <w:p>
+      <w:pPr/>
+      <w:r>
+        <w:t xml:space="preserve">Before choosing the response format in item E, read O*NET's technical reports on a </w:t>
+      </w:r>
+      <w:hyperlink r:id="rId4" w:history="1">
+        <w:r>
+          <w:rPr>
+            <w:rStyle w:val="Hyperlink"/>
+          </w:rPr>
+          <w:t xml:space="preserve">Mini Interest Profiler for mobile devices</w:t>
+        </w:r>
+      </w:hyperlink>
+      <w:r>
+        <w:t xml:space="preserve"> and on </w:t>
+      </w:r>
+      <w:hyperlink r:id="rId5" w:history="1">
+        <w:r>
+          <w:rPr>
+            <w:rStyle w:val="Hyperlink"/>
+          </w:rPr>
+          <w:t xml:space="preserve">emoji anchors for the Interest Profiler Short Form</w:t>
+        </w:r>
+      </w:hyperlink>
+      <w:r>
+        <w:t xml:space="preserve">. I have not read their findings, so check them before relying on them.</w:t>
+      </w:r>
+    </w:p>
+    <w:p>
+      <w:pPr>
+        <w:pStyle w:val="Heading2"/>
+      </w:pPr>
+      <w:r>
+        <w:t xml:space="preserve">Phase 22: Outcome evidence engine (tracer studies, PMKVY, ITI scorecards, PLFS)</w:t>
+      </w:r>
+    </w:p>
+    <w:p>
+      <w:pPr/>
+      <w:r>
+        <w:t xml:space="preserve">Phase 22 turns four messy public sources into one graded outcome table with sample sizes and intervals, and ends the silent fallbacks that hide missing data. Today </w:t>
+      </w:r>
+      <w:r>
+        <w:rPr>
+          <w:rStyle w:val="CodeChar"/>
+        </w:rPr>
+        <w:t xml:space="preserve">OutcomeService.get_trade_outcomes</w:t>
+      </w:r>
+      <w:r>
+        <w:t xml:space="preserve"> falls back to every state's rows when the learner's state has none, without telling anyone. Priority P0, effort 5 to 6 days.</w:t>
+      </w:r>
+    </w:p>
+    <w:p>
+      <w:pPr>
+        <w:pStyle w:val="Code"/>
+      </w:pPr>
+      <w:bookmarkStart w:id="5" w:name="bongo_lang_text_5"/>
+      <w:bookmarkEnd w:id="5"/>
+      <w:r>
+        <w:t xml:space="preserve">PHASE 22 - OUTCOME EVIDENCE ENGINE. Backend + scripts only. No UI.</w:t>
+        <w:br/>
+        <w:t xml:space="preserve">Prereq: Phases 19-20 merged. Read the Data Addendum and docs/ASSUMPTIONS.md.</w:t>
+        <w:br/>
+        <w:br/>
+        <w:t xml:space="preserve">Context: market (85 rows) and provider_outcomes (80 rows) are demo. OutcomeService silently</w:t>
+        <w:br/>
+        <w:t xml:space="preserve">falls back to all rows of an occupation when a state/district has none. Real sources differ</w:t>
+        <w:br/>
+        <w:t xml:space="preserve">in grain, definition and age, so they must be stored in ONE table with those differences</w:t>
+        <w:br/>
+        <w:t xml:space="preserve">explicit, then read through the Phase 19 best_available() policy.</w:t>
+        <w:br/>
+        <w:br/>
+        <w:t xml:space="preserve">Do:</w:t>
+        <w:br/>
+        <w:t xml:space="preserve">A. UNIFIED TABLE. outcome_evidence(id, trade_id, geo_level[provider|district|state|national],</w:t>
+        <w:br/>
+        <w:t xml:space="preserve">   lgd_code, provider_id nullable, period_start, period_end, metric, value, value_shape</w:t>
+        <w:br/>
+        <w:t xml:space="preserve">   [rate|mean|median|band|p25|p75], n, definition[reported|verified|survey], scheme_version</w:t>
+        <w:br/>
+        <w:t xml:space="preserve">   nullable, source_id, evidence_grade, ci_low, ci_high, page_ref, verified_by). metrics:</w:t>
+        <w:br/>
+        <w:t xml:space="preserve">   placement_rate, earnings_monthly_inr, self_employed_pct, apprenticeship_stipend_inr,</w:t>
+        <w:br/>
+        <w:t xml:space="preserve">   pass_rate, admission_rate. Keep market and provider_outcomes as READ MODELS rebuilt by</w:t>
+        <w:br/>
+        <w:t xml:space="preserve">   scripts/build_read_models.py from best_available(). Loaders never write the read models.</w:t>
+        <w:br/>
+        <w:t xml:space="preserve">B. TRACER STUDIES (DGT STRIVE, state reports + national). scripts/ingest_tracer_studies.py.</w:t>
+        <w:br/>
+        <w:t xml:space="preserve">   Prefer pdftotext/pdfplumber-style extraction already on the machine; a new dependency needs</w:t>
+        <w:br/>
+        <w:t xml:space="preserve">   an ASSUMPTIONS.md entry. Output one CSV per state for HUMAN verification (two-person check</w:t>
+        <w:br/>
+        <w:t xml:space="preserve">   on the first 3 states). Every row stores page_ref and table name. Store income exactly as</w:t>
+        <w:br/>
+        <w:t xml:space="preserve">   reported (mean, median or band). Do NOT invent p25/p75 from a mean. State sample sizes</w:t>
+        <w:br/>
+        <w:t xml:space="preserve">   (e.g. a state surveying a few hundred of a few thousand graduates) go in `n`.</w:t>
+        <w:br/>
+        <w:t xml:space="preserve">C. PMKVY. scripts/ingest_pmkvy.py reads official downloads only (data.gov.in state-wise</w:t>
+        <w:br/>
+        <w:t xml:space="preserve">   placement, Dataful exports, dashboard sector extracts, the NSDC PMKVY 2.0 profile study).</w:t>
+        <w:br/>
+        <w:t xml:space="preserve">   Keep scheme_version (1.0/2.0/3.0) as a column; never pool versions. PMKVY 4.0 has no</w:t>
+        <w:br/>
+        <w:t xml:space="preserve">   placement metric: write none. Label each rate reported or verified from the source's own</w:t>
+        <w:br/>
+        <w:t xml:space="preserve">   definition. Reported rates are grade C; verified grade B.</w:t>
+        <w:br/>
+        <w:t xml:space="preserve">D. ITI SCORECARDS. scripts/ingest_iti_scorecards.py loads the DGT per-ITI grading scorecards</w:t>
+        <w:br/>
+        <w:t xml:space="preserve">   (pass %, admission %, trade diversity, female participation as a PROVIDER property). Match</w:t>
+        <w:br/>
+        <w:t xml:space="preserve">   ITIs to centres by DGT/NCVT ITI code; name+district fuzzy matches are needs_review=true.</w:t>
+        <w:br/>
+        <w:t xml:space="preserve">   These scorecards carry no placement or earnings: never display them as outcomes.</w:t>
+        <w:br/>
+        <w:t xml:space="preserve">E. PLFS AGGREGATES. scripts/build_plfs_aggregates.py reads unit-level microdata from</w:t>
+        <w:br/>
+        <w:t xml:space="preserve">   data/raw/labour/ (never committed) and writes ONLY aggregates: survey-weighted p25, median,</w:t>
+        <w:br/>
+        <w:t xml:space="preserve">   p75 of monthly earnings by state x occupation group (NCO 2-digit) x general-education</w:t>
+        <w:br/>
+        <w:t xml:space="preserve">   bucket x vocational-training status x sector (rural/urban), with unweighted n; suppress</w:t>
+        <w:br/>
+        <w:t xml:space="preserve">   n &lt; 30. Keep regular-wage and self-employed earnings separate. PLFS training fields map to</w:t>
+        <w:br/>
+        <w:t xml:space="preserve">   trade FAMILIES only; never claim a trade-level figure from PLFS. Also write</w:t>
+        <w:br/>
+        <w:t xml:space="preserve">   education_route_compare: median earnings by highest general education and technical</w:t>
+        <w:br/>
+        <w:t xml:space="preserve">   qualification per state, so the family question "vocational versus degree" is answered</w:t>
+        <w:br/>
+        <w:t xml:space="preserve">   from data. Label it an association, not a causal effect.</w:t>
+        <w:br/>
+        <w:t xml:space="preserve">F. SHRINKAGE AND INTERVALS. Implement evidence_svc.shrink(): rates use beta-binomial</w:t>
+        <w:br/>
+        <w:t xml:space="preserve">   empirical Bayes toward the parent geography (prior strength m estimated by method of</w:t>
+        <w:br/>
+        <w:t xml:space="preserve">   moments across units); earnings shrink the log-median toward the parent with weight</w:t>
+        <w:br/>
+        <w:t xml:space="preserve">   n / (n + k), k from between-unit variance. Return an 80% interval for every figure.</w:t>
+        <w:br/>
+        <w:t xml:space="preserve">   Convert earnings to one base year with an official CPI series; record the series in</w:t>
+        <w:br/>
+        <w:t xml:space="preserve">   SOURCES.yaml.</w:t>
+        <w:br/>
+        <w:t xml:space="preserve">G. AUDIT. scripts/outcome_audit.py flags: rate &gt; 100, certified &gt; enrolled, p25 &gt; median,</w:t>
+        <w:br/>
+        <w:t xml:space="preserve">   reported-vs-verified gaps above 20 points for the same trade and state, and rows older than</w:t>
+        <w:br/>
+        <w:t xml:space="preserve">   3 years. Output data/processed/outcome_audit.csv.</w:t>
+        <w:br/>
+        <w:t xml:space="preserve">H. API. GET /outcomes and GET /providers/{id}/outcomes return {status, value, interval, n,</w:t>
+        <w:br/>
+        <w:t xml:space="preserve">   level_used, grade, definition, as_of, source_url}. status is "no_verified_data" when nothing</w:t>
+        <w:br/>
+        <w:t xml:space="preserve">   passes the addendum; remove the silent national fallback in outcome_svc.py. Keep</w:t>
+        <w:br/>
+        <w:t xml:space="preserve">   PS-provided datasets (load_provided_dataset.py + mapping.yaml) at top precedence.</w:t>
+        <w:br/>
+        <w:t xml:space="preserve">I. TESTS. Per-source ingestion fixtures (3 rows each, one with a bad definition); shrinkage</w:t>
+        <w:br/>
+        <w:t xml:space="preserve">   unit tests (n=5 vs n=500 behave as expected); n&lt;30 suppression; no-fallback test; PMKVY 4.0</w:t>
+        <w:br/>
+        <w:t xml:space="preserve">   writes no placement row; PLFS loader emits no unit-level rows (assert columns).</w:t>
+        <w:br/>
+        <w:br/>
+        <w:t xml:space="preserve">Gate:</w:t>
+        <w:br/>
+        <w:t xml:space="preserve">- `make check` green; data_report shows outcome coverage per metric x grade x state.</w:t>
+        <w:br/>
+        <w:t xml:space="preserve">- Target (report the real number): grade A/B earnings range for &gt;= 25 trades in the pilot</w:t>
+        <w:br/>
+        <w:t xml:space="preserve">  state and &gt;= 5 other states; every other trade returns no_verified_data, not a guess.</w:t>
+        <w:br/>
+        <w:t xml:space="preserve">- outcome_audit.csv written and reviewed; no row without page_ref or source_url.</w:t>
+        <w:br/>
+        <w:t xml:space="preserve">STOP and report with pasted command output.</w:t>
+      </w:r>
+    </w:p>
+    <w:p>
+      <w:pPr/>
+      <w:r>
+        <w:t xml:space="preserve">Files touched: backend/app/models/outcome_evidence.py, scripts/ingest_tracer_studies.py, ingest_pmkvy.py, ingest_iti_scorecards.py, build_plfs_aggregates.py, build_read_models.py, outcome_audit.py, backend/app/services/evidence_svc.py, outcome_svc.py, backend/app/api/routes/outcomes.py, new Alembic revision.</w:t>
+      </w:r>
+    </w:p>
+    <w:p>
+      <w:pPr>
+        <w:pStyle w:val="Heading2"/>
+      </w:pPr>
+      <w:r>
+        <w:t xml:space="preserve">Phase 23: Recommender v2 (real features, bug fixes, honest explanations)</w:t>
+      </w:r>
+    </w:p>
+    <w:p>
+      <w:pPr/>
+      <w:r>
+        <w:t xml:space="preserve">Phase 23 fixes the wiring defects first, then lets real evidence into the ranking without rewarding data that merely happens to exist. The "top 100%" label in your screenshot is finding 1 in the audit table. Priority P0, effort 4 to 5 days.</w:t>
+      </w:r>
+    </w:p>
+    <w:p>
+      <w:pPr>
+        <w:pStyle w:val="Code"/>
+      </w:pPr>
+      <w:bookmarkStart w:id="6" w:name="bongo_lang_text_6"/>
+      <w:bookmarkEnd w:id="6"/>
+      <w:r>
+        <w:t xml:space="preserve">PHASE 23 - RECOMMENDER V2. Backend + eval harness. Frontend only for the reason-chip text.</w:t>
+        <w:br/>
+        <w:t xml:space="preserve">Prereq: Phases 19-22 merged. Read the Data Addendum.</w:t>
+        <w:br/>
+        <w:br/>
+        <w:t xml:space="preserve">Context (verified): _salary_percentile in services/recommend_svc.py returns median/max of an</w:t>
+        <w:br/>
+        <w:t xml:space="preserve">occupation's state rows (77 of 81 occupations -&gt; None -&gt; 0.5; 4 occupations -&gt; exactly 1.0,</w:t>
+        <w:br/>
+        <w:t xml:space="preserve">rendered "top 100%"). aptitude_fit in ml/ranking/features.py is the same for every candidate.</w:t>
+        <w:br/>
+        <w:t xml:space="preserve">WITHIN_BUDGET always fires (fee_ratio capped at 1.0). Budget bands differ between features.py</w:t>
+        <w:br/>
+        <w:t xml:space="preserve">(10k/50k/200k) and filters.py (20k/60k/unlimited). _local_demand ignores the learner's</w:t>
+        <w:br/>
+        <w:t xml:space="preserve">state/district. Retrieval (weight 0.20) re-uses the RIASEC signal. No outcome feature exists.</w:t>
+        <w:br/>
+        <w:br/>
+        <w:t xml:space="preserve">Step 1 - BUG FIXES (own commit, before any new feature):</w:t>
+        <w:br/>
+        <w:t xml:space="preserve"> a. Delete _salary_percentile and the GOOD_EARNINGS template wording "top {pct}%".</w:t>
+        <w:br/>
+        <w:t xml:space="preserve"> b. One budget source: backend/app/core/budget.py BUDGET_LIMITS, imported by filters.py and</w:t>
+        <w:br/>
+        <w:t xml:space="preserve">    features.py. fee_ratio is uncapped for explanation; cap only inside scoring.</w:t>
+        <w:br/>
+        <w:t xml:space="preserve">    WITHIN_BUDGET fires only when fee &lt;= the learner's band limit and states that limit.</w:t>
+        <w:br/>
+        <w:t xml:space="preserve"> c. Unify EDU_HIERARCHY (filters.py) and EDU_TO_NSQF (features.py) into one module. NSQF</w:t>
+        <w:br/>
+        <w:t xml:space="preserve">    levels come from the NQR-sourced courses table, not the demo seed.</w:t>
+        <w:br/>
+        <w:t xml:space="preserve"> d. Retrieval becomes candidate generation only (top-50 shortlist). Its score is NOT added to</w:t>
+        <w:br/>
+        <w:t xml:space="preserve">    the ranking. Pass the learner's free-text work preference as stated_interests when present.</w:t>
+        <w:br/>
+        <w:t xml:space="preserve"> e. Fix the Hindi typo in CAREER_MATCH (templates_hi_en.json) and have a Hindi reader review.</w:t>
+        <w:br/>
+        <w:t xml:space="preserve"> f. Regression tests for each of a-e, including the exact screenshot case (Fitter, low band).</w:t>
+        <w:br/>
+        <w:br/>
+        <w:t xml:space="preserve">Step 2 - NEW FEATURES (extend FEATURE_ORDER, train.py and the fallback scorer; bump</w:t>
+        <w:br/>
+        <w:t xml:space="preserve">model_version to kaushalpath-rank-0.2.0):</w:t>
+        <w:br/>
+        <w:t xml:space="preserve"> - aptitude_fit_occ: from ml/ranking/aptitude_fit.py (Phase 21). Replaces aptitude_fit.</w:t>
+        <w:br/>
+        <w:t xml:space="preserve"> - interest_confidence: from the SEM of the learner's top RIASEC dimensions. Low confidence</w:t>
+        <w:br/>
+        <w:t xml:space="preserve">   shifts weight from interest to aptitude and outcomes.</w:t>
+        <w:br/>
+        <w:t xml:space="preserve"> - earnings_median_pct and earnings_floor_pct: percentile, among the learner's ELIGIBLE</w:t>
+        <w:br/>
+        <w:t xml:space="preserve">   trades in their geography, of the log median and of p25 (parents care about the downside).</w:t>
+        <w:br/>
+        <w:t xml:space="preserve">   Source: best_available() on outcome_evidence. A percentile is only computed across trades.</w:t>
+        <w:br/>
+        <w:t xml:space="preserve"> - placement_est and placement_conf: shrunk placement rate and its interval width (Phase 22).</w:t>
+        <w:br/>
+        <w:t xml:space="preserve"> - local_demand: from PLFS employment share of the trade family in the learner's state plus</w:t>
+        <w:br/>
+        <w:t xml:space="preserve">   PMKVY sector placement rate. Grade C; labelled as a proxy, never as "vacancies".</w:t>
+        <w:br/>
+        <w:t xml:space="preserve"> - progression_value: count of verified pathways (NSQF level-up, lateral entry,</w:t>
+        <w:br/>
+        <w:t xml:space="preserve">   apprenticeship) for the course from progression_paths.</w:t>
+        <w:br/>
+        <w:t xml:space="preserve"> - net_cost_ratio: fee after scheme eligibility (schemes rules + income_band) over the</w:t>
+        <w:br/>
+        <w:t xml:space="preserve">   learner's budget limit.</w:t>
+        <w:br/>
+        <w:t xml:space="preserve"> - provider_quality: used to ORDER centres inside each recommendation (distance, then</w:t>
+        <w:br/>
+        <w:t xml:space="preserve">   outcome n &gt;= 30, then scorecard), not to rank courses.</w:t>
+        <w:br/>
+        <w:br/>
+        <w:t xml:space="preserve">Step 3 - MISSING DATA IS NEUTRAL, NOT REWARDED:</w:t>
+        <w:br/>
+        <w:t xml:space="preserve"> - Features without a passing evidence row are marked missing and their weight is</w:t>
+        <w:br/>
+        <w:t xml:space="preserve">   renormalised across the available features. Do not fill 0.5 constants.</w:t>
+        <w:br/>
+        <w:t xml:space="preserve"> - Add has_data flags to the explanation payload only. A test must prove two otherwise</w:t>
+        <w:br/>
+        <w:t xml:space="preserve">   identical trades that differ only in data availability get the same score.</w:t>
+        <w:br/>
+        <w:br/>
+        <w:t xml:space="preserve">Step 4 - DEFAULT WEIGHTS (transparent scorer; tune ONLY on non-circular validation in</w:t>
+        <w:br/>
+        <w:t xml:space="preserve">Phase 24, never on the locked test split):</w:t>
+        <w:br/>
+        <w:t xml:space="preserve"> interest 0.30 (riasec 0.22, top3 overlap 0.08) | aptitude_fit_occ 0.20 |</w:t>
+        <w:br/>
+        <w:t xml:space="preserve"> outcomes 0.25 (placement_est 0.10, earnings_median_pct 0.08, earnings_floor_pct 0.07) |</w:t>
+        <w:br/>
+        <w:t xml:space="preserve"> local_demand 0.08 | cost (net_cost_ratio) 0.07 | distance 0.05 | progression_value 0.05.</w:t>
+        <w:br/>
+        <w:t xml:space="preserve"> LightGBM stays optional and may only be trained on labels that do not come from the rubric.</w:t>
+        <w:br/>
+        <w:br/>
+        <w:t xml:space="preserve">Step 5 - CONFIDENCE AND ABSTENTION:</w:t>
+        <w:br/>
+        <w:t xml:space="preserve"> Each recommendation returns confidence (high|medium|low) from interest SEM, evidence grade</w:t>
+        <w:br/>
+        <w:t xml:space="preserve"> and n, plus data_gaps[] in plain words (e.g. "No verified earnings for this trade in your</w:t>
+        <w:br/>
+        <w:t xml:space="preserve"> district; showing the state figure, grade B"). If all top-3 are low confidence, return</w:t>
+        <w:br/>
+        <w:t xml:space="preserve"> counsellor_suggested = true and wire it to services/escalation_svc.py.</w:t>
+        <w:br/>
+        <w:br/>
+        <w:t xml:space="preserve">Step 6 - REASON CODES (ml/explain/reason_codes.py + templates_hi_en.json, EN and HI):</w:t>
+        <w:br/>
+        <w:t xml:space="preserve"> Add EARNINGS_RANGE (p25-p75, geography level, year, n, grade), PLACEMENT_RATE (rate,</w:t>
+        <w:br/>
+        <w:t xml:space="preserve"> interval, n, definition), PROGRESSION_PATH, PROVIDER_QUALITY, APTITUDE_GAP (shortfall</w:t>
+        <w:br/>
+        <w:t xml:space="preserve"> construct only). Every code carries evidence_id, source, grade. A code with no evidence row</w:t>
+        <w:br/>
+        <w:t xml:space="preserve"> is omitted. Test: every number in a rendered description appears in its evidence row.</w:t>
+        <w:br/>
+        <w:t xml:space="preserve"> The two-code minimum is satisfied by INTEREST_MATCH and ELIGIBLE only when outcome data is</w:t>
+        <w:br/>
+        <w:t xml:space="preserve"> absent, and the card then shows the data_gaps line.</w:t>
+        <w:br/>
+        <w:br/>
+        <w:t xml:space="preserve">Step 7 - FAMILY CONTEXT (optional): from education_route_compare show the earnings</w:t>
+        <w:br/>
+        <w:t xml:space="preserve"> difference between the learner's education baseline and the recommended route as an</w:t>
+        <w:br/>
+        <w:t xml:space="preserve"> association with n and grade, never as a promise.</w:t>
+        <w:br/>
+        <w:br/>
+        <w:t xml:space="preserve">Step 8 - COMPARE AGAINST v0.1: replay 200 personas through both versions. Report Kendall tau</w:t>
+        <w:br/>
+        <w:t xml:space="preserve"> of the top-10, how many top-3 slots changed, and the dominant feature behind each change.</w:t>
+        <w:br/>
+        <w:br/>
+        <w:t xml:space="preserve">Gate:</w:t>
+        <w:br/>
+        <w:t xml:space="preserve">- `make check` green; G1 (eligibility violations) still 0%. `make eval` runs unchanged gates.</w:t>
+        <w:br/>
+        <w:t xml:space="preserve">- The screenshot scenario no longer shows "top 100%" or an always-on budget chip.</w:t>
+        <w:br/>
+        <w:t xml:space="preserve">- Missing-data neutrality test, faithfulness test and budget single-source test pass.</w:t>
+        <w:br/>
+        <w:t xml:space="preserve">- v0.1 vs v0.2 comparison report written to eval/reports/.</w:t>
+        <w:br/>
+        <w:t xml:space="preserve">STOP and report with pasted command output.</w:t>
+      </w:r>
+    </w:p>
+    <w:p>
+      <w:pPr/>
+      <w:r>
+        <w:t xml:space="preserve">Files touched: backend/app/core/budget.py, ml/ranking/ (features.py, filters.py, ranker.py, aptitude_fit.py, train.py), ml/explain/ (reason_codes.py, templates_hi_en.json), services/recommend_svc.py, escalation_svc.py hook, core/config.py (weights), frontend ReasonChip.tsx text only, eval/scripts/compare_versions.py.</w:t>
+      </w:r>
+    </w:p>
+    <w:p>
+      <w:pPr>
+        <w:pStyle w:val="Heading2"/>
+      </w:pPr>
+      <w:r>
+        <w:t xml:space="preserve">Phase 24: Evaluation v2 (accuracy that is not graded by its own signals)</w:t>
+      </w:r>
+    </w:p>
+    <w:p>
+      <w:pPr/>
+      <w:r>
+        <w:t xml:space="preserve">Phase 24 replaces rubric-derived labels with expert-rated gold, adds validity evidence for the assessment, and backtests the outcome numbers, so every accuracy claim names its data and its sample size. Your current G2 100% and G3 0.967 stay in the report, relabelled as consistency checks. Priority P0 for any accuracy claim, effort 4 to 5 days plus expert rating time.</w:t>
+      </w:r>
+    </w:p>
+    <w:p>
+      <w:pPr>
+        <w:pStyle w:val="Code"/>
+      </w:pPr>
+      <w:bookmarkStart w:id="7" w:name="bongo_lang_text_7"/>
+      <w:bookmarkEnd w:id="7"/>
+      <w:r>
+        <w:t xml:space="preserve">PHASE 24 - EVALUATION V2. eval/ + docs only. Do not change ranker weights in this phase.</w:t>
+        <w:br/>
+        <w:t xml:space="preserve">Prereq: Phases 19-23 merged and a pilot dataset exists (&gt;= 300 learners). Read the Data Addendum.</w:t>
+        <w:br/>
+        <w:br/>
+        <w:t xml:space="preserve">Context: eval/gold/labels.jsonl is produced by label_with_rubric.py from the same catalogue</w:t>
+        <w:br/>
+        <w:t xml:space="preserve">signals the ranker uses (interest 40 / eligibility 30 / market 20 / cost 10), on synthetic</w:t>
+        <w:br/>
+        <w:t xml:space="preserve">personas. G4 is measured on simulated respondents. These prove internal consistency only.</w:t>
+        <w:br/>
+        <w:br/>
+        <w:t xml:space="preserve">Do:</w:t>
+        <w:br/>
+        <w:t xml:space="preserve">A. PRE-REGISTER. Create eval/GATES.yaml with every gate, metric definition, data source,</w:t>
+        <w:br/>
+        <w:t xml:space="preserve">   minimum n and target BEFORE running anything. Reports print the file's sha256. Proposed</w:t>
+        <w:br/>
+        <w:t xml:space="preserve">   targets (edit only before the first run, never lower afterwards):</w:t>
+        <w:br/>
+        <w:t xml:space="preserve">   expert-gold NDCG@5 &gt;= 0.80; expert-acceptable top-3 hit-rate &gt;= 90%; inter-rater</w:t>
+        <w:br/>
+        <w:t xml:space="preserve">   agreement (Krippendorff alpha) &gt;= 0.60; test-retest r &gt;= 0.70 per RIASEC dimension;</w:t>
+        <w:br/>
+        <w:t xml:space="preserve">   convergent r &gt;= 0.60; known-groups AUC &gt;= 0.65; 80% interval coverage between 70% and 90%.</w:t>
+        <w:br/>
+        <w:t xml:space="preserve">B. EXPERT GOLD. Build 150-200 learner profiles (real pilot profiles where consented, plus</w:t>
+        <w:br/>
+        <w:t xml:space="preserve">   counsellor-written vignettes matched to real state x education x income distributions).</w:t>
+        <w:br/>
+        <w:t xml:space="preserve">   &gt;= 3 independent counsellors rate each profile against a candidate list that does NOT show</w:t>
+        <w:br/>
+        <w:t xml:space="preserve">   model scores, on a 0-3 suitability scale, using a rubric text written before rating.</w:t>
+        <w:br/>
+        <w:t xml:space="preserve">   Compute alpha. If alpha &lt; 0.60, revise the rubric and re-rate; do not average away</w:t>
+        <w:br/>
+        <w:t xml:space="preserve">   disagreement. Split 50% dev / 50% LOCKED test; the locked split is evaluated once per</w:t>
+        <w:br/>
+        <w:t xml:space="preserve">   release. Retire label_with_rubric.py from labelling (keep it as a baseline model only).</w:t>
+        <w:br/>
+        <w:t xml:space="preserve">C. REALISED-PATH CHECK (plausibility, not correctness). Using PLFS unit-level data kept</w:t>
+        <w:br/>
+        <w:t xml:space="preserve">   locally (aggregates only leave the script): for respondents aged 18-30 with 10th/12th</w:t>
+        <w:br/>
+        <w:t xml:space="preserve">   education and vocational training, test whether the recommender's top-3 trade FAMILIES</w:t>
+        <w:br/>
+        <w:t xml:space="preserve">   (inputs: education, state, income band only) contain the family they actually work in,</w:t>
+        <w:br/>
+        <w:t xml:space="preserve">   as lift over two baselines: the most common family in the state, and a random eligible</w:t>
+        <w:br/>
+        <w:t xml:space="preserve">   family. Observed work reflects constraints, not preference: report it as plausibility.</w:t>
+        <w:br/>
+        <w:t xml:space="preserve">D. ASSESSMENT VALIDITY. Consume the Phase 21 study outputs: test-retest, convergent,</w:t>
+        <w:br/>
+        <w:t xml:space="preserve">   known-groups. Report estimates with 95% bootstrap intervals and n. If a study has not run,</w:t>
+        <w:br/>
+        <w:t xml:space="preserve">   the report says "not yet measured"; it never substitutes simulated numbers.</w:t>
+        <w:br/>
+        <w:t xml:space="preserve">E. OUTCOME BACKTEST. For trade x state cells with two or more periods, predict the later</w:t>
+        <w:br/>
+        <w:t xml:space="preserve">   period's placement rate and earnings from the earlier period using the shrunk estimate and</w:t>
+        <w:br/>
+        <w:t xml:space="preserve">   the raw value. Report MAE for both, and 80% interval coverage. Split by evidence grade.</w:t>
+        <w:br/>
+        <w:t xml:space="preserve">F. ABLATIONS on the dev split: drop outcome features, drop aptitude_fit_occ, drop retrieval</w:t>
+        <w:br/>
+        <w:t xml:space="preserve">   candidate generation, swap India-adjusted RIASEC for O*NET prior. Report the change in</w:t>
+        <w:br/>
+        <w:t xml:space="preserve">   expert NDCG@5 for each, so the report shows which datasets add accuracy.</w:t>
+        <w:br/>
+        <w:t xml:space="preserve">G. FAIRNESS AND COVERAGE (no protected attributes). Slices: urban/rural, income band,</w:t>
+        <w:br/>
+        <w:t xml:space="preserve">   education level, language (en/hi/hinglish). Report gaps with intervals; keep the 3-point</w:t>
+        <w:br/>
+        <w:t xml:space="preserve">   gap gate on expert gold, not on synthetic data. Add a COVERAGE metric: share of learners</w:t>
+        <w:br/>
+        <w:t xml:space="preserve">   whose top-3 include a no_verified_data outcome, by state and rural/urban. Report it; if a</w:t>
+        <w:br/>
+        <w:t xml:space="preserve">   gap exceeds 10 points, record it in docs/ASSUMPTIONS.md with the proposed fallback.</w:t>
+        <w:br/>
+        <w:t xml:space="preserve">H. LEAKAGE CHECKS. scripts/check_leakage.py fails if any gold profile or its respondent</w:t>
+        <w:br/>
+        <w:t xml:space="preserve">   appears in the calibration set, if rubric fields appear as ranker features, or if the</w:t>
+        <w:br/>
+        <w:t xml:space="preserve">   locked split was used for weight tuning (compare config hashes).</w:t>
+        <w:br/>
+        <w:t xml:space="preserve">I. REPORT. Rewrite docs/EVAL_REPORT.md in three tiers: Tier 1 rule properties (G1, G5);</w:t>
+        <w:br/>
+        <w:t xml:space="preserve">   Tier 2 expert- and pilot-validated metrics (B, D, E); Tier 3 simulated or consistency</w:t>
+        <w:br/>
+        <w:t xml:space="preserve">   checks (old G2/G3/G4, labelled "simulated"). Each metric states data source, n and</w:t>
+        <w:br/>
+        <w:t xml:space="preserve">   interval. No top-1 accuracy claim. `make eval-final` must reproduce it from a fresh clone.</w:t>
+        <w:br/>
+        <w:t xml:space="preserve">J. TESTS. GATES.yaml schema test; alpha calculation against a known fixture; leakage check</w:t>
+        <w:br/>
+        <w:t xml:space="preserve">   failing on a seeded leak; backtest on a toy panel; coverage metric test.</w:t>
+        <w:br/>
+        <w:br/>
+        <w:t xml:space="preserve">Gate:</w:t>
+        <w:br/>
+        <w:t xml:space="preserve">- `make check` green; `make eval-final` reproduces docs/EVAL_REPORT.md.</w:t>
+        <w:br/>
+        <w:t xml:space="preserve">- Every Tier 2 number has data source, n and interval, or says "not yet measured".</w:t>
+        <w:br/>
+        <w:t xml:space="preserve">- check_leakage.py passes; GATES.yaml hash printed and unchanged since pre-registration.</w:t>
+        <w:br/>
+        <w:t xml:space="preserve">STOP and report with pasted command output.</w:t>
+      </w:r>
+    </w:p>
+    <w:p>
+      <w:pPr/>
+      <w:r>
+        <w:t xml:space="preserve">Files touched: eval/GATES.yaml, eval/gold/expert_ratings.csv, eval/scripts/ (run_expert_eval.py, realised_path.py, backtest_outcomes.py, ablations.py, check_leakage.py, fairness_coverage.py), docs/EVAL_REPORT.md, Makefile targets.</w:t>
+      </w:r>
+    </w:p>
+    <w:p>
+      <w:pPr>
+        <w:pStyle w:val="Heading2"/>
+      </w:pPr>
+      <w:r>
+        <w:t xml:space="preserve">Sources and open caveats</w:t>
+      </w:r>
+    </w:p>
+    <w:p>
+      <w:pPr/>
+      <w:r>
+        <w:t xml:space="preserve">Only the two O*NET pages were opened and read in full; every other source below came from search results, so open it and confirm file names, columns and terms before the loaders depend on it.</w:t>
+      </w:r>
+    </w:p>
+    <w:p>
+      <w:pPr>
+        <w:pStyle w:val="ListParagraph"/>
+        <w:numPr>
+          <w:ilvl w:val="0"/>
+          <w:numId w:val="2"/>
+        </w:numPr>
+      </w:pPr>
+      <w:r>
+        <w:t xml:space="preserve">Opened and read: </w:t>
+      </w:r>
+      <w:hyperlink r:id="rId3" w:history="1">
+        <w:r>
+          <w:rPr>
+            <w:rStyle w:val="Hyperlink"/>
+          </w:rPr>
+          <w:t xml:space="preserve">O*NET 31.0 data dictionary</w:t>
+        </w:r>
+      </w:hyperlink>
+      <w:r>
+        <w:t xml:space="preserve"> and </w:t>
+      </w:r>
+      <w:hyperlink r:id="rId6" w:history="1">
+        <w:r>
+          <w:rPr>
+            <w:rStyle w:val="Hyperlink"/>
+          </w:rPr>
+          <w:t xml:space="preserve">Career Interest Types file description</w:t>
+        </w:r>
+      </w:hyperlink>
+      <w:r>
+        <w:t xml:space="preserve"> (CC BY 4.0; file renamed from Interests in 30.3; scales OI and IH; about 900 occupations rated).</w:t>
+      </w:r>
+    </w:p>
+    <w:p>
+      <w:pPr>
+        <w:pStyle w:val="ListParagraph"/>
+        <w:numPr>
+          <w:ilvl w:val="0"/>
+          <w:numId w:val="2"/>
+        </w:numPr>
+      </w:pPr>
+      <w:r>
+        <w:t xml:space="preserve">From search results: </w:t>
+      </w:r>
+      <w:hyperlink r:id="rId7" w:history="1">
+        <w:r>
+          <w:rPr>
+            <w:rStyle w:val="Hyperlink"/>
+          </w:rPr>
+          <w:t xml:space="preserve">DGT STRIVE tracer studies</w:t>
+        </w:r>
+      </w:hyperlink>
+      <w:r>
+        <w:t xml:space="preserve">, </w:t>
+      </w:r>
+      <w:hyperlink r:id="rId8" w:history="1">
+        <w:r>
+          <w:rPr>
+            <w:rStyle w:val="Hyperlink"/>
+          </w:rPr>
+          <w:t xml:space="preserve">UP tracer study</w:t>
+        </w:r>
+      </w:hyperlink>
+      <w:r>
+        <w:t xml:space="preserve">, </w:t>
+      </w:r>
+      <w:hyperlink r:id="rId9" w:history="1">
+        <w:r>
+          <w:rPr>
+            <w:rStyle w:val="Hyperlink"/>
+          </w:rPr>
+          <w:t xml:space="preserve">national tracer study</w:t>
+        </w:r>
+      </w:hyperlink>
+      <w:r>
+        <w:t xml:space="preserve">, </w:t>
+      </w:r>
+      <w:hyperlink r:id="rId10" w:history="1">
+        <w:r>
+          <w:rPr>
+            <w:rStyle w:val="Hyperlink"/>
+          </w:rPr>
+          <w:t xml:space="preserve">DGT ITI grading</w:t>
+        </w:r>
+      </w:hyperlink>
+      <w:r>
+        <w:t xml:space="preserve">, </w:t>
+      </w:r>
+      <w:hyperlink r:id="rId11" w:history="1">
+        <w:r>
+          <w:rPr>
+            <w:rStyle w:val="Hyperlink"/>
+          </w:rPr>
+          <w:t xml:space="preserve">PLFS microdata portal</w:t>
+        </w:r>
+      </w:hyperlink>
+      <w:r>
+        <w:t xml:space="preserve">, </w:t>
+      </w:r>
+      <w:hyperlink r:id="rId12" w:history="1">
+        <w:r>
+          <w:rPr>
+            <w:rStyle w:val="Hyperlink"/>
+          </w:rPr>
+          <w:t xml:space="preserve">Dataful PMKVY year-wise</w:t>
+        </w:r>
+      </w:hyperlink>
+      <w:r>
+        <w:t xml:space="preserve">, </w:t>
+      </w:r>
+      <w:hyperlink r:id="rId13" w:history="1">
+        <w:r>
+          <w:rPr>
+            <w:rStyle w:val="Hyperlink"/>
+          </w:rPr>
+          <w:t xml:space="preserve">Dataful PMKVY overall</w:t>
+        </w:r>
+      </w:hyperlink>
+      <w:r>
+        <w:t xml:space="preserve">, </w:t>
+      </w:r>
+      <w:hyperlink r:id="rId14" w:history="1">
+        <w:r>
+          <w:rPr>
+            <w:rStyle w:val="Hyperlink"/>
+          </w:rPr>
+          <w:t xml:space="preserve">NSDC PMKVY 2.0 sector study</w:t>
+        </w:r>
+      </w:hyperlink>
+      <w:r>
+        <w:t xml:space="preserve">, </w:t>
+      </w:r>
+      <w:hyperlink r:id="rId15" w:history="1">
+        <w:r>
+          <w:rPr>
+            <w:rStyle w:val="Hyperlink"/>
+          </w:rPr>
+          <w:t xml:space="preserve">NCO-2015 Vol I</w:t>
+        </w:r>
+      </w:hyperlink>
+      <w:r>
+        <w:t xml:space="preserve">. ASER 2023 Beyond Basics and the data.gov.in state-wise PMKVY 3.0 placement table were also found by search; locate them on their own portals.</w:t>
+      </w:r>
+    </w:p>
+    <w:p>
+      <w:pPr/>
+      <w:r>
+        <w:t xml:space="preserve">Open caveats:</w:t>
+      </w:r>
+    </w:p>
+    <w:p>
+      <w:pPr>
+        <w:pStyle w:val="ListParagraph"/>
+        <w:numPr>
+          <w:ilvl w:val="0"/>
+          <w:numId w:val="3"/>
+        </w:numPr>
+      </w:pPr>
+      <w:r>
+        <w:t xml:space="preserve">Findings in the audit come from reading the code and running the seed CSVs. I did not run your test suite or app; run </w:t>
+      </w:r>
+      <w:r>
+        <w:rPr>
+          <w:rStyle w:val="CodeChar"/>
+        </w:rPr>
+        <w:t xml:space="preserve">make check</w:t>
+      </w:r>
+      <w:r>
+        <w:t xml:space="preserve"> to confirm nothing else changed.</w:t>
+      </w:r>
+    </w:p>
+    <w:p>
+      <w:pPr>
+        <w:pStyle w:val="ListParagraph"/>
+        <w:numPr>
+          <w:ilvl w:val="0"/>
+          <w:numId w:val="3"/>
+        </w:numPr>
+      </w:pPr>
+      <w:r>
+        <w:t xml:space="preserve">Every threshold and weight in the prompts (n of 30, fuzzy ratio 92, spread 0.2, w = n / (n + 20), the 70% coverage target, the default ranker weights) is a proposal. Tune on dev data and record each change in docs/ASSUMPTIONS.md.</w:t>
+      </w:r>
+    </w:p>
+    <w:p>
+      <w:pPr>
+        <w:pStyle w:val="ListParagraph"/>
+        <w:numPr>
+          <w:ilvl w:val="0"/>
+          <w:numId w:val="3"/>
+        </w:numPr>
+      </w:pPr>
+      <w:r>
+        <w:t xml:space="preserve">O*NET profiles describe US occupations and cover only part of the Indian trade list. A ready-made O*NET-to-NCO file is not confirmed, so expect manual review in Phase 20.</w:t>
+      </w:r>
+    </w:p>
+    <w:p>
+      <w:pPr>
+        <w:pStyle w:val="ListParagraph"/>
+        <w:numPr>
+          <w:ilvl w:val="0"/>
+          <w:numId w:val="3"/>
+        </w:numPr>
+      </w:pPr>
+      <w:r>
+        <w:t xml:space="preserve">Placement figures disagree across PMKVY sources because definitions differ (reported versus verified, scheme version). PMKVY 4.0 has no placement metric to ingest.</w:t>
+      </w:r>
+    </w:p>
+    <w:p>
+      <w:pPr>
+        <w:pStyle w:val="ListParagraph"/>
+        <w:numPr>
+          <w:ilvl w:val="0"/>
+          <w:numId w:val="3"/>
+        </w:numPr>
+      </w:pPr>
+      <w:r>
+        <w:t xml:space="preserve">PLFS shows associations, not effects, and its training fields are too coarse for trade-level claims. Check the microdata access terms before downloading.</w:t>
+      </w:r>
+    </w:p>
+    <w:p>
+      <w:pPr>
+        <w:pStyle w:val="ListParagraph"/>
+        <w:numPr>
+          <w:ilvl w:val="0"/>
+          <w:numId w:val="3"/>
+        </w:numPr>
+      </w:pPr>
+      <w:r>
+        <w:t xml:space="preserve">Tracer-study samples are small in some states and the tables sit in PDFs, so extraction needs human verification.</w:t>
+      </w:r>
+    </w:p>
+    <w:p>
+      <w:pPr>
+        <w:pStyle w:val="ListParagraph"/>
+        <w:numPr>
+          <w:ilvl w:val="0"/>
+          <w:numId w:val="3"/>
+        </w:numPr>
+      </w:pPr>
+      <w:r>
+        <w:t xml:space="preserve">No public dataset covers parental sentiment; the resistance dashboard depends on your own pilot logs.</w:t>
       </w:r>
     </w:p>
     <w:sectPr>
@@ -2127,6 +3180,12 @@
     </w:lvl>
   </w:abstractNum>
   <w:num w:numId="1">
+    <w:abstractNumId w:val="0"/>
+  </w:num>
+  <w:num w:numId="2">
+    <w:abstractNumId w:val="0"/>
+  </w:num>
+  <w:num w:numId="3">
     <w:abstractNumId w:val="0"/>
   </w:num>
 </w:numbering>

</xml_diff>